<commit_message>
Watermark manuscripts and cover letters as AI-generated demonstrations
Adds a watermark (PDF), banner (HTML, Markdown, Quarto) and header (Word)
reading 'AI-GENERATED DEMONSTRATION - NOT PEER REVIEWED - NOT FOR CITATION'.
The unwatermarked files are in the parent commit.

Co-Authored-By: Claude Opus 5.5 (1M context) <noreply@anthropic.com>
</commit_message>
<xml_diff>
--- a/anchoring-extremity-opaq/manuscript/manuscript.docx
+++ b/anchoring-extremity-opaq/manuscript/manuscript.docx
@@ -2,6 +2,15 @@
 <file path=word/document.xml><?xml version="1.0" encoding="utf-8"?>
 <w:document xmlns:w="http://schemas.openxmlformats.org/wordprocessingml/2006/main" xmlns:m="http://schemas.openxmlformats.org/officeDocument/2006/math" xmlns:r="http://schemas.openxmlformats.org/officeDocument/2006/relationships" xmlns:o="urn:schemas-microsoft-com:office:office" xmlns:v="urn:schemas-microsoft-com:vml" xmlns:w10="urn:schemas-microsoft-com:office:word" xmlns:a="http://schemas.openxmlformats.org/drawingml/2006/main" xmlns:pic="http://schemas.openxmlformats.org/drawingml/2006/picture" xmlns:wp="http://schemas.openxmlformats.org/drawingml/2006/wordprocessingDrawing">
   <w:body>
+    <w:p>
+      <w:r>
+        <w:rPr>
+          <w:b/>
+          <w:color w:val="B00020"/>
+        </w:rPr>
+        <w:t>AI-GENERATED DEMONSTRATION — NOT PEER REVIEWED — NOT FOR CITATION. agentic-research-examples: AI-generated demonstration for the tutorial "Easing into agentic AI in research". See AI_GENERATED.md.</w:t>
+      </w:r>
+    </w:p>
     <w:p>
       <w:pPr>
         <w:pStyle w:val="Title"/>
@@ -8415,6 +8424,7 @@
     </w:tbl>
     <w:bookmarkEnd w:id="116"/>
     <w:sectPr>
+      <w:headerReference w:type="default" r:id="rId9"/>
       <w:footnotePr>
         <w:numRestart w:val="eachSect"/>
       </w:footnotePr>
@@ -8444,6 +8454,26 @@
     </w:p>
   </w:footnote>
 </w:footnotes>
+</file>
+
+<file path=word/header1.xml><?xml version="1.0" encoding="utf-8"?>
+<w:hdr xmlns:m="http://schemas.openxmlformats.org/officeDocument/2006/math" xmlns:mc="http://schemas.openxmlformats.org/markup-compatibility/2006" xmlns:mo="http://schemas.microsoft.com/office/mac/office/2008/main" xmlns:mv="urn:schemas-microsoft-com:mac:vml" xmlns:o="urn:schemas-microsoft-com:office:office" xmlns:r="http://schemas.openxmlformats.org/officeDocument/2006/relationships" xmlns:v="urn:schemas-microsoft-com:vml" xmlns:w10="urn:schemas-microsoft-com:office:word" xmlns:w14="http://schemas.microsoft.com/office/word/2010/wordml" xmlns:w="http://schemas.openxmlformats.org/wordprocessingml/2006/main" xmlns:wne="http://schemas.microsoft.com/office/word/2006/wordml" xmlns:wp14="http://schemas.microsoft.com/office/word/2010/wordprocessingDrawing" xmlns:wp="http://schemas.openxmlformats.org/drawingml/2006/wordprocessingDrawing" xmlns:wpc="http://schemas.microsoft.com/office/word/2010/wordprocessingCanvas" xmlns:wpg="http://schemas.microsoft.com/office/word/2010/wordprocessingGroup" xmlns:wpi="http://schemas.microsoft.com/office/word/2010/wordprocessingInk" xmlns:wps="http://schemas.microsoft.com/office/word/2010/wordprocessingShape" mc:Ignorable="w14 wp14">
+  <w:p>
+    <w:r>
+      <w:rPr>
+        <w:b/>
+        <w:color w:val="B00020"/>
+        <w:sz w:val="18"/>
+      </w:rPr>
+      <w:t>AI-GENERATED DEMONSTRATION — NOT PEER REVIEWED — NOT FOR CITATION</w:t>
+    </w:r>
+  </w:p>
+  <w:p>
+    <w:pPr>
+      <w:pStyle w:val="Header"/>
+    </w:pPr>
+  </w:p>
+</w:hdr>
 </file>
 
 <file path=word/numbering.xml><?xml version="1.0" encoding="utf-8"?>

</xml_diff>